<commit_message>
chore: commit working-tree state before main merge (chapters, RQs, notebook, skills)
Uncommitted session work swept in ahead of the merge with origin/main:
research-questions updates, ch1-ch5 draft touches + regenerated docx,
project-state/thesis-topic updates, agentic notebook, references.md,
imported .agents/skills set, settings. Also keeps pre_csd_1.5_eda.OURS.py
as the pre-adoption reference copy.

Co-Authored-By: Claude Opus 4.8 <noreply@anthropic.com>
</commit_message>
<xml_diff>
--- a/thesis/thesis-writing/sections-final/ch1-introduction.docx
+++ b/thesis/thesis-writing/sections-final/ch1-introduction.docx
@@ -2,33 +2,13 @@
 <file path=word/document.xml><?xml version="1.0" encoding="utf-8"?>
 <w:document xmlns:w="http://schemas.openxmlformats.org/wordprocessingml/2006/main" xmlns:m="http://schemas.openxmlformats.org/officeDocument/2006/math" xmlns:r="http://schemas.openxmlformats.org/officeDocument/2006/relationships" xmlns:o="urn:schemas-microsoft-com:office:office" xmlns:v="urn:schemas-microsoft-com:vml" xmlns:w10="urn:schemas-microsoft-com:office:word" xmlns:a="http://schemas.openxmlformats.org/drawingml/2006/main" xmlns:pic="http://schemas.openxmlformats.org/drawingml/2006/picture" xmlns:wp="http://schemas.openxmlformats.org/drawingml/2006/wordprocessingDrawing">
   <w:body>
-    <w:bookmarkStart w:id="15" w:name="chapter-1-introduction"/>
+    <w:bookmarkStart w:id="19" w:name="chapter-1-introduction"/>
     <w:p>
       <w:pPr>
         <w:pStyle w:val="Heading1"/>
       </w:pPr>
       <w:r>
         <w:t xml:space="preserve">Chapter 1 — Introduction</w:t>
-      </w:r>
-    </w:p>
-    <w:p>
-      <w:pPr>
-        <w:pStyle w:val="BlockText"/>
-      </w:pPr>
-      <w:r>
-        <w:t xml:space="preserve">Status: PROSE DRAFT — written 2026-04-05, em dashes removed 2026-04-12, citation corrected 2026-04-12</w:t>
-      </w:r>
-      <w:r>
-        <w:t xml:space="preserve"> </w:t>
-      </w:r>
-      <w:r>
-        <w:t xml:space="preserve">Author: Claude Code (Sonnet 4.6) — requires human review before finalisation</w:t>
-      </w:r>
-      <w:r>
-        <w:t xml:space="preserve"> </w:t>
-      </w:r>
-      <w:r>
-        <w:t xml:space="preserve">Word count target: ~8 standard CBS pages (2,275 chars/page)</w:t>
       </w:r>
     </w:p>
     <w:p>
@@ -38,7 +18,7 @@
         </w:pict>
       </w:r>
     </w:p>
-    <w:bookmarkStart w:id="9" w:name="background-and-motivation"/>
+    <w:bookmarkStart w:id="10" w:name="background-and-motivation"/>
     <w:p>
       <w:pPr>
         <w:pStyle w:val="Heading2"/>
@@ -60,7 +40,7 @@
         <w:pStyle w:val="BodyText"/>
       </w:pPr>
       <w:r>
-        <w:t xml:space="preserve">This transition from descriptive to predictive decision-support is particularly consequential in the fast-moving consumer goods (FMCG) sector, where demand volatility, promotional dynamics, seasonal variation, and stock keeping unit (SKU) proliferation create forecasting challenges that traditional statistical approaches struggle to address (Ma et al., 2025). In the beverage segment, the domain investigated in this thesis, demand patterns are often erratic, intermittent, and sensitive to external signals such as consumer sentiment, seasonal consumption trends, and promotional calendars. These characteristics render uniform forecasting approaches inadequate: Ma et al. (2025) demonstrate in a large-scale empirical study of a private-label beverage manufacturer that no single model dominates across all demand patterns, and that machine learning models enriched with exogenous contextual features substantially outperform statistical baselines for high-volume stable SKUs.</w:t>
+        <w:t xml:space="preserve">This transition from descriptive to forecast-informed decision-support is particularly consequential in the fast-moving consumer goods (FMCG) sector, where demand volatility, promotional dynamics, seasonal variation, and stock keeping unit (SKU) proliferation create forecasting challenges that traditional statistical approaches struggle to address (Ma et al., 2025). In the beverage segment, the domain investigated in this thesis, demand patterns are often erratic, intermittent, and sensitive to external signals such as consumer sentiment, seasonal consumption trends, and promotional calendars. These characteristics render uniform forecasting approaches inadequate: Ma et al. (2025) demonstrate in a large-scale empirical study of a private-label beverage manufacturer that no single model dominates across all demand patterns, and that machine learning models enriched with exogenous contextual features substantially outperform statistical baselines for high-volume stable SKUs.</w:t>
       </w:r>
     </w:p>
     <w:p>
@@ -78,29 +58,57 @@
           <w:i/>
           <w:iCs/>
         </w:rPr>
-        <w:t xml:space="preserve">“One thing that remains to be determined is the possible improvement in PF and PI performances that can be achieved by expanding time series forecasting to include explanatory/exogenous variables. This element could be explored in future M Competitions, thus expanding time series forecasting competitions in a new and ambitious direction.”</w:t>
-      </w:r>
-      <w:r>
-        <w:t xml:space="preserve"> </w:t>
-      </w:r>
-      <w:r>
-        <w:t xml:space="preserve">This thesis directly responds to that call.</w:t>
-      </w:r>
-    </w:p>
-    <w:p>
-      <w:pPr>
-        <w:pStyle w:val="BodyText"/>
-      </w:pPr>
-      <w:r>
-        <w:t xml:space="preserve">Yet the practical deployment of predictive AI systems in business settings faces a constraint that the academic forecasting literature has largely left unexamined: computational resource limitations. Enterprise cloud deployments capable of running large deep learning models at scale are economically inaccessible to small and medium-sized AI providers. Ng (2017), working with four terabytes of Nielsen weekly scanner data, demonstrated empirically that memory constraints are the primary binding design variable in retail scanner data analysis; even with unlimited financial resources, the full dataset cannot be loaded simultaneously, making memory-efficient algorithmic choices not merely convenient but necessary. For the realistic cloud deployment budget of an SME AI provider, a ceiling of approximately eight gigabytes of total RAM is not a worst-case assumption but a practical constraint that eliminates most transformer-based architectures and severely limits model selection options.</w:t>
-      </w:r>
-    </w:p>
-    <w:p>
-      <w:pPr>
-        <w:pStyle w:val="BodyText"/>
-      </w:pPr>
-      <w:r>
-        <w:t xml:space="preserve">This constraint has received no systematic attention in the multi-agent AI literature, where frameworks for LLM-based decision support consistently assume cloud-scale compute infrastructure. The gap is not merely technical: it reflects a broader structural asymmetry in AI research, where benchmarks and system designs are validated on infrastructure available to large research labs and technology companies, while the majority of organisations that could benefit from predictive AI operate with considerably more limited resources. Bridging this asymmetry by demonstrating that reliable predictive decision-support is achievable within the resource envelope of an SME cloud deployment is itself a research contribution independent of the specific domain application. The emerging paradigm of Agentic AI, which comprises systems composed of multiple specialised agents that coordinate, communicate, and dynamically allocate sub-tasks to achieve a common goal (Sapkota et al., 2025), has demonstrated substantial promise across industrial, clinical, and scientific applications. González-Potes et al. (2026) deployed a hybrid deterministic/LLM multi-agent architecture for industrial process supervision, achieving specification compliance rates above 98% and median LLM numerical errors below 3%, validating that LLM-based decision support can meet production reliability standards when architectural design carefully separates deterministic and generative components. However, González-Potes et al. (2026) explicitly acknowledge that their architecture was designed for continuous real-time industrial process supervision and does not address predictive forecasting over historical tabular retail data, multi-criteria synthesis of competing model outputs, or resource-constrained deployment with a fixed RAM budget. This is precisely the gap this thesis addresses. The Danish retail market provides a particularly appropriate empirical context for this investigation. Denmark is a mature, highly concentrated retail market dominated by a small number of large grocery chains, in which scanner panel data, collected systematically by providers such as Nielsen, offers granular, longitudinal insight into sales dynamics at the product and retailer level. At the same time, the Danish Consumer Survey (Indeks Danmark) provides one of the most comprehensive sources of consumer attitudinal and behavioural data in Scandinavia, covering over 20,000 respondents and 6,000 variables. The co-availability of these two data sources, namely transactional scanner data and consumer survey intelligence, in a single national market creates a unique opportunity to evaluate whether the integration of heterogeneous signals from different measurement traditions can materially improve predictive decision-support in FMCG retail.</w:t>
+        <w:t xml:space="preserve">“One thing that remains to be determined is the possible improvement in PF and PI performances that can be achieved by expanding time series forecasting to include explanatory/exogenous variables.</w:t>
+      </w:r>
+      <w:r>
+        <w:rPr>
+          <w:rStyle w:val="FootnoteReference"/>
+        </w:rPr>
+        <w:footnoteReference w:id="9"/>
+      </w:r>
+      <w:r>
+        <w:rPr>
+          <w:i/>
+          <w:iCs/>
+        </w:rPr>
+        <w:t xml:space="preserve"> </w:t>
+      </w:r>
+      <w:r>
+        <w:rPr>
+          <w:i/>
+          <w:iCs/>
+        </w:rPr>
+        <w:t xml:space="preserve">This element could be explored in future M Competitions, thus expanding time series forecasting competitions in a new and ambitious direction.”</w:t>
+      </w:r>
+      <w:r>
+        <w:t xml:space="preserve"> </w:t>
+      </w:r>
+      <w:r>
+        <w:t xml:space="preserve">This thesis takes up that direction by incorporating exogenous predictors into its forecasting substrate, while extending the problem beyond forecasting accuracy alone to how such forecasts can be reliably integrated into a resource-constrained agentic decision-support system.</w:t>
+      </w:r>
+    </w:p>
+    <w:p>
+      <w:pPr>
+        <w:pStyle w:val="BodyText"/>
+      </w:pPr>
+      <w:r>
+        <w:t xml:space="preserve">Yet the practical deployment of predictive AI systems in business settings faces a constraint that the academic forecasting literature has largely left unexamined: computational resource limitations. Enterprise cloud deployments capable of running large deep learning models at scale are economically inaccessible to small and medium-sized AI providers. The cost asymmetry is stark: transformer-based forecasters and locally hosted large language models require GPU instances with tens to hundreds of gigabytes of accelerator memory, which on major cloud platforms cost on the order of one to seven US dollars per hour of continuous operation [CITATION TO ADD: cloud-instance pricing source], whereas a general-purpose instance with eight gigabytes of RAM costs a small fraction of that. For a provider serving inference continuously across many client queries, this differential compounds into an order-of-magnitude difference in operating cost, which is why resource-efficient deployment is treated as a first-order constraint in the edge and resource-constrained AI literature (Liu et al., 2025; Semerikov et al., 2025). Ng (2017), working with four terabytes of Nielsen weekly scanner data, demonstrated empirically that memory constraints are the primary binding design variable in retail scanner data analysis; even with unlimited financial resources, the full dataset cannot be loaded simultaneously, making memory-efficient algorithmic choices not merely convenient but necessary. For the realistic cloud deployment budget of an SME AI provider, a ceiling of approximately eight gigabytes of total RAM is not a worst-case assumption but a practical constraint that eliminates most transformer-based architectures and severely limits model selection options.</w:t>
+      </w:r>
+    </w:p>
+    <w:p>
+      <w:pPr>
+        <w:pStyle w:val="BodyText"/>
+      </w:pPr>
+      <w:r>
+        <w:t xml:space="preserve">This constraint has received no systematic attention in the agentic AI literature, where frameworks for LLM-based decision support consistently assume cloud-scale compute infrastructure. The gap is not merely technical: it reflects a broader structural asymmetry in AI research, where benchmarks and system designs are validated on infrastructure available to large research labs and technology companies, while the majority of organisations that could benefit from forecast-informed decision-support operate with considerably more limited resources. Bridging this asymmetry by demonstrating that reliable forecast-informed decision-support is achievable within the resource envelope of an SME cloud deployment is itself a research contribution independent of the specific domain application. The emerging paradigm of Agentic AI, comprising systems of multiple specialised agents that coordinate, communicate, and dynamically allocate sub-tasks to achieve a common goal (Sapkota et al., 2025), has demonstrated substantial promise across industrial, clinical, and scientific applications, with systems such as AutoFlow, ScoreFlow, and SciAgent establishing the orchestration patterns reviewed in Chapter 2. The architecturally closest of these to the present work is the hybrid deterministic/LLM system of González-Potes et al. (2026), deployed for industrial process supervision, which achieved specification compliance rates above 98% and median LLM numerical errors below 3%, suggesting that LLM-based decision support can approach production-relevant reliability requirements when the architecture carefully separates deterministic and generative components. On the forecasting side, Rinaldi et al. (2025) bring agentic decision support closer to the present domain through DSS4EX, an explainability layer over time series forecasting pipelines. Neither line of work, however, addresses the specific combination this thesis targets: a lightweight forecasting substrate, exposed to a bounded tool-using agentic layer through a structured interface that preserves reliability and uncertainty, and deployed under a fixed RAM budget. This combination is the gap the thesis addresses.</w:t>
+      </w:r>
+    </w:p>
+    <w:p>
+      <w:pPr>
+        <w:pStyle w:val="BodyText"/>
+      </w:pPr>
+      <w:r>
+        <w:t xml:space="preserve">The Danish retail market provides a particularly appropriate empirical context for this investigation. Denmark is a mature, highly concentrated retail market dominated by a small number of large grocery chains, in which scanner panel data, collected systematically by providers such as Nielsen, offers granular, longitudinal insight into sales dynamics at the product and retailer level. The Nielsen scanner panel is the core forecasting input for this thesis.</w:t>
       </w:r>
     </w:p>
     <w:p>
@@ -110,8 +118,8 @@
         </w:pict>
       </w:r>
     </w:p>
-    <w:bookmarkEnd w:id="9"/>
-    <w:bookmarkStart w:id="10" w:name="research-problem"/>
+    <w:bookmarkEnd w:id="10"/>
+    <w:bookmarkStart w:id="11" w:name="research-problem"/>
     <w:p>
       <w:pPr>
         <w:pStyle w:val="Heading2"/>
@@ -125,7 +133,7 @@
         <w:pStyle w:val="FirstParagraph"/>
       </w:pPr>
       <w:r>
-        <w:t xml:space="preserve">The commercial context motivating this research is Manifold AI, a Danish artificial intelligence company building</w:t>
+        <w:t xml:space="preserve">The commercial context motivating this research is Manifold AI, a Danish company building</w:t>
       </w:r>
       <w:r>
         <w:t xml:space="preserve"> </w:t>
@@ -137,39 +145,15 @@
         <w:t xml:space="preserve"> </w:t>
       </w:r>
       <w:r>
-        <w:t xml:space="preserve">a conversational AI system for retail analytics currently operating at the descriptive level. The system answers questions about what has happened: sales volumes, market shares, and weighted distribution metrics; it does not forecast, does not anticipate, and does not recommend. Transitioning to predictive decision-support requires three capabilities that are currently absent: the ability to generate reliable demand forecasts under tight computational constraints; the ability to integrate heterogeneous data signals, specifically structured scanner panel data and external consumer survey signals, into a coherent analytical output; and the ability to synthesise these outputs into natural language recommendations that are actionable for non-technical business managers.</w:t>
-      </w:r>
-    </w:p>
-    <w:p>
-      <w:pPr>
-        <w:pStyle w:val="BodyText"/>
-      </w:pPr>
-      <w:r>
-        <w:t xml:space="preserve">Each of these three challenges constitutes a genuine unsolved problem at the intersection of forecasting, multi-agent systems, and decision support. First, the model selection problem under RAM constraints has no established solution: the forecasting literature benchmarks models primarily on accuracy metrics, with only recent work beginning to systematically measure computational cost alongside predictive performance (Klee &amp; Xia, 2025). Klee and Xia explicitly call for further research on production-level deployment stability, noting that</w:t>
-      </w:r>
-      <w:r>
-        <w:t xml:space="preserve"> </w:t>
-      </w:r>
-      <w:r>
-        <w:rPr>
-          <w:i/>
-          <w:iCs/>
-        </w:rPr>
-        <w:t xml:space="preserve">“a deeper understanding of cycle-to-cycle stability across models is an important practical consideration for forecasting models that are deployed in production systems.”</w:t>
-      </w:r>
-      <w:r>
-        <w:t xml:space="preserve"> </w:t>
-      </w:r>
-      <w:r>
-        <w:t xml:space="preserve">Second, the integration of consumer survey signals as exogenous inputs into ML-based demand forecasting pipelines remains underexplored, a gap formally identified by Makridakis et al. (2020) as an open research frontier. Third, the synthesis of heterogeneous model outputs into confidence-scored natural language recommendations within a multi-agent architecture has been demonstrated in industrial contexts (González-Potes et al., 2026) but not in retail demand forecasting, where data sparsity, promotional non-linearity, and managerial planning horizons create distinct design requirements.</w:t>
-      </w:r>
-    </w:p>
-    <w:p>
-      <w:pPr>
-        <w:pStyle w:val="BodyText"/>
-      </w:pPr>
-      <w:r>
-        <w:t xml:space="preserve">This thesis addresses these three challenges through a unified multi-agent framework that coordinates lightweight machine learning forecasting, consumer signal enrichment, and LLM-based synthesis, designed to operate within the 8GB RAM constraint that defines realistic SME cloud deployment.</w:t>
+        <w:t xml:space="preserve">a conversational, production-oriented agentic decision-support system for retail analytics that currently operates at the descriptive level: it reports what has happened, including sales volumes, market shares, and weighted distribution, but does not forecast, anticipate, or recommend; this production system also serves as the empirical reference case for the thesis. Extending such a non-predictive agentic system with predictive capability raises four problems. First, the forecasting substrate must be accurate yet deployable within a tight computational budget, a trade-off the forecasting literature has only recently begun to measure systematically (Klee &amp; Xia, 2025). Second, its forecasts must be exposed to the agentic layer through a structured tool interface that preserves reliability, uncertainty, and traceability. Third, the production agentic system itself must possess the architectural and operational capabilities required to integrate such a substrate. Fourth, the resulting decision-support outputs must demonstrably improve, at justified cost, on what a general-purpose LLM that writes and self-corrects its own code (a code-as-action baseline) would produce; the dedicated-model integration must earn its place against this strong LLM-only alternative.</w:t>
+      </w:r>
+    </w:p>
+    <w:p>
+      <w:pPr>
+        <w:pStyle w:val="BodyText"/>
+      </w:pPr>
+      <w:r>
+        <w:t xml:space="preserve">This thesis addresses these problems by extending a production-oriented agentic decision-support system with a lightweight forecasting substrate, exposed through a structured forecast-tool interface to a bounded tool-using agentic decision-support layer, and by specifying the integration-readiness capabilities such an extension requires, all designed to operate within the 8GB RAM budget characteristic of realistic SME cloud deployment.</w:t>
       </w:r>
     </w:p>
     <w:p>
@@ -179,8 +163,8 @@
         </w:pict>
       </w:r>
     </w:p>
-    <w:bookmarkEnd w:id="10"/>
-    <w:bookmarkStart w:id="11" w:name="research-questions"/>
+    <w:bookmarkEnd w:id="11"/>
+    <w:bookmarkStart w:id="15" w:name="research-questions"/>
     <w:p>
       <w:pPr>
         <w:pStyle w:val="Heading2"/>
@@ -219,7 +203,7 @@
           <w:i/>
           <w:iCs/>
         </w:rPr>
-        <w:t xml:space="preserve">How can AI systems be designed to provide reliable predictive decision-support in real-world business environments under computational constraints?</w:t>
+        <w:t xml:space="preserve">How can production-oriented agentic decision-support systems without native predictive capabilities be extended with lightweight forecasting models to support reliable, forecast-informed, and cost-justified decision-making under computational and deployment constraints?</w:t>
       </w:r>
     </w:p>
     <w:p>
@@ -227,7 +211,7 @@
         <w:pStyle w:val="FirstParagraph"/>
       </w:pPr>
       <w:r>
-        <w:t xml:space="preserve">This question is decomposed into four subsidiary research questions, each targeting a specific component of the design and evaluation challenge:</w:t>
+        <w:t xml:space="preserve">This question is decomposed into four subsidiary research questions, each targeting a component of the design and evaluation challenge:</w:t>
       </w:r>
     </w:p>
     <w:p>
@@ -252,15 +236,15 @@
           <w:i/>
           <w:iCs/>
         </w:rPr>
-        <w:t xml:space="preserve">Which predictive modelling approaches provide the best balance between forecasting accuracy and computational efficiency under realistic cloud resource constraints?</w:t>
-      </w:r>
-    </w:p>
-    <w:p>
-      <w:pPr>
-        <w:pStyle w:val="BodyText"/>
-      </w:pPr>
-      <w:r>
-        <w:t xml:space="preserve">SRQ1 motivates the empirical model benchmark presented in Chapter 6, where five lightweight forecasting models (ARIMA, Prophet, LightGBM, XGBoost, and Ridge Regression) are evaluated simultaneously on forecasting accuracy (MAPE, RMSE), computational efficiency (peak RAM usage, runtime), and forecast stability (coefficient of variation across repeated runs). This tri-dimensional evaluation framework is necessary because accuracy alone is insufficient for production deployment: a model with marginally lower MAPE but substantially higher RAM usage or output instability represents a worse engineering choice in a resource-constrained environment (Klee &amp; Xia, 2025). The five models were selected to span the space from classical statistical approaches with well-understood memory footprints (ARIMA) to gradient-boosted ensemble methods that have demonstrated state-of-the-art retail forecasting performance (LightGBM, XGBoost), ensuring that the benchmark provides actionable guidance across the full accuracy-efficiency trade-off frontier.</w:t>
+        <w:t xml:space="preserve">Which lightweight forecasting models provide the best trade-off between accuracy, memory efficiency, and category specialization for FMCG demand forecasting under computational constraints?</w:t>
+      </w:r>
+    </w:p>
+    <w:p>
+      <w:pPr>
+        <w:pStyle w:val="BodyText"/>
+      </w:pPr>
+      <w:r>
+        <w:t xml:space="preserve">SRQ1 motivates the empirical model benchmark in Chapter 6, which evaluates lightweight forecasting models across the five beverage categories on forecasting accuracy, memory efficiency, and forecast stability, and tests whether category-specialised models outperform a single pooled model. Accuracy alone is insufficient for production deployment: a model with marginally lower error but higher memory use or unstable output is a worse engineering choice under a fixed RAM budget (Klee &amp; Xia, 2025). The models, metrics, and protocol are defined in Chapter 3.</w:t>
       </w:r>
     </w:p>
     <w:p>
@@ -285,15 +269,15 @@
           <w:i/>
           <w:iCs/>
         </w:rPr>
-        <w:t xml:space="preserve">How can a multi-agent architecture coordinate predictive models and heterogeneous data signals to generate actionable managerial recommendations?</w:t>
-      </w:r>
-    </w:p>
-    <w:p>
-      <w:pPr>
-        <w:pStyle w:val="BodyText"/>
-      </w:pPr>
-      <w:r>
-        <w:t xml:space="preserve">SRQ2 motivates the design and implementation of the Synthesis Module in Chapter 7, where the outputs of the forecasting models are aggregated by an LLM-orchestrated Synthesis Agent into a confidence-scored natural language recommendation. The coordination logic, shared state management, and human-approval gates are implemented via a LangGraph-based multi-agent pipeline and constitute the primary architectural contribution of the thesis. The design draws on the principle, established empirically by Makridakis et al. (2020) and theoretically by the model averaging literature (Ahrens et al., 2024), that data-driven combination of multiple model outputs is systematically superior to pre-selecting a single best model, and extends this principle to the generation of business-level recommendations rather than numerical forecasts alone.</w:t>
+        <w:t xml:space="preserve">How can forecasting outputs be exposed to an agentic decision-support system through a structured tool/action interface that preserves reliability, uncertainty, and traceability?</w:t>
+      </w:r>
+    </w:p>
+    <w:p>
+      <w:pPr>
+        <w:pStyle w:val="BodyText"/>
+      </w:pPr>
+      <w:r>
+        <w:t xml:space="preserve">SRQ2 motivates the design of a structured forecast-tool interface (Chapter 5) and its realisation in a bounded tool-using agentic decision-support layer (Chapter 7). The interface is designed to preserve reliability (validating agent outputs against the source forecasts), uncertainty (forecasts accompanied by interval information), and traceability (a recorded mapping from tool call and forecast value to recommendation). The prototype uses a lightweight Python coordinator with JSON-based function calling; a LangGraph deployment, as in the production reference system, is the production target rather than the implementation evaluated in this thesis.</w:t>
       </w:r>
     </w:p>
     <w:p>
@@ -318,15 +302,15 @@
           <w:i/>
           <w:iCs/>
         </w:rPr>
-        <w:t xml:space="preserve">To what extent does additional contextual information improve the predictive and decision-support capabilities of AI systems?</w:t>
-      </w:r>
-    </w:p>
-    <w:p>
-      <w:pPr>
-        <w:pStyle w:val="BodyText"/>
-      </w:pPr>
-      <w:r>
-        <w:t xml:space="preserve">SRQ3 motivates the controlled evaluation in Chapter 7 of whether including Indeks Danmark consumer survey signals as exogenous features improves forecast accuracy and recommendation quality relative to a baseline using only Nielsen scanner data. This directly responds to the explicit call by Makridakis et al. (2020) for research on the value of explanatory variables in forecasting pipelines, and extends the M5 finding (Makridakis et al., 2022), which demonstrated that exogenous promotional and calendar variables improve retail forecasting, to a qualitatively different class of external signal: consumer attitudinal data collected through a dedicated national survey. Whether such signals, operating at a different temporal resolution and semantic level than transactional records, translate into measurable forecasting and recommendation improvements is an empirical question this thesis is positioned to answer.</w:t>
+        <w:t xml:space="preserve">What architectural and operational capabilities are required for a production-oriented agentic system to integrate forecast-informed decision-support?</w:t>
+      </w:r>
+    </w:p>
+    <w:p>
+      <w:pPr>
+        <w:pStyle w:val="BodyText"/>
+      </w:pPr>
+      <w:r>
+        <w:t xml:space="preserve">SRQ3 motivates an integration-readiness specification (Chapter 5, assessed in Chapters 7 and 9): the capabilities, namely a structured tool interface for invoking external predictive models, observability and traceability of tool calls, explicit handling of reliability and uncertainty, and operation within bounded cost, latency, and memory, that a production-oriented agentic system must possess to incorporate a forecasting substrate. These capabilities are assessed using a real production-oriented agentic system as the empirical case, rather than through a completed production deployment.</w:t>
       </w:r>
     </w:p>
     <w:p>
@@ -351,15 +335,80 @@
           <w:i/>
           <w:iCs/>
         </w:rPr>
-        <w:t xml:space="preserve">How does the proposed predictive AI system compare to traditional descriptive analytics approaches used in business intelligence systems?</w:t>
-      </w:r>
-    </w:p>
-    <w:p>
-      <w:pPr>
-        <w:pStyle w:val="BodyText"/>
-      </w:pPr>
-      <w:r>
-        <w:t xml:space="preserve">SRQ4 motivates the comparative evaluation in Chapter 8, where the multi-agent predictive framework is benchmarked against a descriptive analytics baseline representing the current state of the Manifold AI system. The comparison is conducted on defined decision quality metrics, establishing the incremental value of the predictive transition over the status quo. This sub-question is necessary to ground the technical contributions of SRQ1–SRQ3 in organisational reality: a system that is technically sophisticated but delivers no measurable improvement over simpler alternatives would not constitute a meaningful contribution to either research or practice.</w:t>
+        <w:t xml:space="preserve">To what extent does integrating dedicated lightweight forecasting models into an agentic decision-support system improve the correctness, consistency, and replicability of forecast-informed decision-support outputs, at justified cost and latency, compared with a general-purpose LLM that writes and self-corrects its own forecasting code (a code-as-action baseline)?</w:t>
+      </w:r>
+    </w:p>
+    <w:p>
+      <w:pPr>
+        <w:pStyle w:val="BodyText"/>
+      </w:pPr>
+      <w:r>
+        <w:t xml:space="preserve">SRQ4 motivates the comparative evaluation in Chapter 8, which tests whether integrating dedicated forecasting models into the agentic system is warranted at all, or whether a general-purpose LLM that writes, executes, and self-corrects its own forecasting code (a code-as-action baseline, runnable in a sandboxed environment) is already sufficient. The two approaches are compared on correctness, consistency, and replicability as primary dimensions and on cost and latency as secondary dimensions, using a separate judge model with bias awareness and a human-rated subset. This evaluation is conducted at pilot scale in the first instance rather than as a full study; a full evaluation across the target prompt set, and an optional comparison against the non-predictive production reference system, are identified as further work.</w:t>
+      </w:r>
+    </w:p>
+    <w:p>
+      <w:pPr>
+        <w:pStyle w:val="CaptionedFigure"/>
+      </w:pPr>
+      <w:r>
+        <w:drawing>
+          <wp:inline>
+            <wp:extent cx="5334000" cy="2035342"/>
+            <wp:effectExtent b="0" l="0" r="0" t="0"/>
+            <wp:docPr descr="Figure 1.1 — Hierarchical structure of the research questions: the main research question and its four subsidiary questions (SRQ1–SRQ4)." title="" id="13" name="Picture"/>
+            <a:graphic>
+              <a:graphicData uri="http://schemas.openxmlformats.org/drawingml/2006/picture">
+                <pic:pic>
+                  <pic:nvPicPr>
+                    <pic:cNvPr descr="../figures/ch1_research_questions_tree.png" id="14" name="Picture"/>
+                    <pic:cNvPicPr>
+                      <a:picLocks noChangeArrowheads="1" noChangeAspect="1"/>
+                    </pic:cNvPicPr>
+                  </pic:nvPicPr>
+                  <pic:blipFill>
+                    <a:blip r:embed="rId12"/>
+                    <a:stretch>
+                      <a:fillRect/>
+                    </a:stretch>
+                  </pic:blipFill>
+                  <pic:spPr bwMode="auto">
+                    <a:xfrm>
+                      <a:off x="0" y="0"/>
+                      <a:ext cx="5334000" cy="2035342"/>
+                    </a:xfrm>
+                    <a:prstGeom prst="rect">
+                      <a:avLst/>
+                    </a:prstGeom>
+                    <a:noFill/>
+                    <a:ln w="9525">
+                      <a:noFill/>
+                      <a:headEnd/>
+                      <a:tailEnd/>
+                    </a:ln>
+                  </pic:spPr>
+                </pic:pic>
+              </a:graphicData>
+            </a:graphic>
+          </wp:inline>
+        </w:drawing>
+      </w:r>
+    </w:p>
+    <w:p>
+      <w:pPr>
+        <w:pStyle w:val="ImageCaption"/>
+      </w:pPr>
+      <w:r>
+        <w:rPr>
+          <w:b/>
+          <w:bCs/>
+        </w:rPr>
+        <w:t xml:space="preserve">Figure 1.1</w:t>
+      </w:r>
+      <w:r>
+        <w:t xml:space="preserve"> </w:t>
+      </w:r>
+      <w:r>
+        <w:t xml:space="preserve">— Hierarchical structure of the research questions: the main research question and its four subsidiary questions (SRQ1–SRQ4).</w:t>
       </w:r>
     </w:p>
     <w:p>
@@ -369,8 +418,8 @@
         </w:pict>
       </w:r>
     </w:p>
-    <w:bookmarkEnd w:id="11"/>
-    <w:bookmarkStart w:id="12" w:name="delimitation"/>
+    <w:bookmarkEnd w:id="15"/>
+    <w:bookmarkStart w:id="16" w:name="delimitation"/>
     <w:p>
       <w:pPr>
         <w:pStyle w:val="Heading2"/>
@@ -402,7 +451,7 @@
         <w:t xml:space="preserve"> </w:t>
       </w:r>
       <w:r>
-        <w:t xml:space="preserve">The thesis focuses exclusively on the Danish carbonated soft drinks (CSD) retail market. This delimitation is driven by data availability: the Nielsen/Prometheus scanner panel covers 28 Danish retailers across approximately 36 monthly periods, providing sufficient longitudinal depth for time series forecasting while remaining manageable within the RAM constraint. The CSD category was selected in collaboration with Manifold AI as representative of the FMCG challenges the system must address, including high promotional sensitivity, seasonal demand patterns, and strong competitive dynamics, while being sufficiently bounded to permit rigorous empirical evaluation within the thesis timeline.</w:t>
+        <w:t xml:space="preserve">The thesis focuses on the Danish beverage retail market, evaluated across five Nielsen product categories: carbonated soft drinks (CSD), still and sparkling water (danskvand), energy drinks (energidrikke), ready-to-drink beverages (RTD), and beer (totalbeer). This multi-category scope is driven by data availability and by the design of the model benchmark: the Nielsen/Prometheus scanner panel provides between 37 and 42 monthly periods per category (CSD being the longest, October 2022 to March 2026), giving sufficient longitudinal depth for time series forecasting while remaining manageable within the RAM constraint. The five categories were selected in collaboration with Manifold AI as representative of the FMCG challenges the system must address, including high promotional sensitivity, seasonal demand patterns, and strong competitive dynamics, while differing systematically in scale (brand counts range from 42 in RTD to 455 in beer), which allows the benchmark to test whether the modelling findings generalise across heterogeneous category structures.</w:t>
       </w:r>
     </w:p>
     <w:p>
@@ -456,7 +505,7 @@
         <w:t xml:space="preserve"> </w:t>
       </w:r>
       <w:r>
-        <w:t xml:space="preserve">The thesis does not aim to produce a production-ready deployed system. The multi-agent framework is a research prototype evaluated on historical data using Design Science Research methodology (Hevner et al., 2004; Peffers et al., 2007). Its outputs are validated against defined research metrics, specifically forecast accuracy, computational efficiency, recommendation quality, and comparative performance against a descriptive baseline, but not against live business outcomes.</w:t>
+        <w:t xml:space="preserve">The thesis does not aim to produce a production-ready deployed system. The artefact, a lightweight forecasting substrate with a bounded tool-using agentic decision-support layer, is a research prototype evaluated on historical data using Design Science Research methodology (Hevner et al., 2004; Peffers et al., 2007). Its outputs are to be validated against defined research metrics, specifically forecast accuracy, computational efficiency, recommendation quality, and comparative performance against a general-purpose code-as-action LLM baseline at pilot scale, but not against live business outcomes.</w:t>
       </w:r>
     </w:p>
     <w:p>
@@ -474,7 +523,7 @@
         <w:t xml:space="preserve"> </w:t>
       </w:r>
       <w:r>
-        <w:t xml:space="preserve">The thesis does not address other FMCG categories, other national markets, or data sources beyond the Nielsen scanner panel and Indeks Danmark consumer survey. Generalisation of the framework’s findings to other retail contexts is a direction for future research.</w:t>
+        <w:t xml:space="preserve">The thesis is bounded to the Danish market and to the Nielsen scanner panel as the data source. While the five-category benchmark provides evidence on whether the modelling findings hold across heterogeneous beverage categories, generalisation to other national markets, to non-beverage FMCG categories, or to other data sources lies beyond its scope and is a direction for future research.</w:t>
       </w:r>
     </w:p>
     <w:p>
@@ -484,8 +533,8 @@
         </w:pict>
       </w:r>
     </w:p>
-    <w:bookmarkEnd w:id="12"/>
-    <w:bookmarkStart w:id="13" w:name="thesis-structure"/>
+    <w:bookmarkEnd w:id="16"/>
+    <w:bookmarkStart w:id="17" w:name="thesis-structure"/>
     <w:p>
       <w:pPr>
         <w:pStyle w:val="Heading2"/>
@@ -517,7 +566,7 @@
         <w:t xml:space="preserve"> </w:t>
       </w:r>
       <w:r>
-        <w:t xml:space="preserve">presents a structured literature review across five research angles: multi-agent and LLM-based decision support, predictive modelling for retail FMCG, ensemble methods and model averaging, multi-criteria decision synthesis, and design science methodology. This review establishes the theoretical foundations and academic gap that the thesis addresses.</w:t>
+        <w:t xml:space="preserve">reviews the literature across eight thematic sections: forecasting as a predictive substrate for FMCG demand; lightweight machine learning under computational and deployment constraints; the transition from descriptive business intelligence to forecast-informed decision-support; LLM agents and tool-mediated reasoning; the reliability, traceability, uncertainty, and evaluation of agentic outputs; production-oriented agentic systems and integration readiness; the research gap; and Design Science Research. This review establishes the theoretical foundations and the gap that the thesis addresses.</w:t>
       </w:r>
     </w:p>
     <w:p>
@@ -535,7 +584,7 @@
         <w:t xml:space="preserve"> </w:t>
       </w:r>
       <w:r>
-        <w:t xml:space="preserve">details the research methodology, grounding the thesis within Design Science Research and specifying the data sources, preprocessing pipeline, evaluation metrics, and three-level validation framework that govern all subsequent empirical work.</w:t>
+        <w:t xml:space="preserve">details the research methodology, grounding the thesis in Design Science Research and specifying the data sources, preprocessing, the forecasting-model benchmark, the structured forecast-tool interface, the integration-readiness assessment, and the evaluation design that compares dedicated-model agentic decision-support against a code-as-action LLM baseline.</w:t>
       </w:r>
     </w:p>
     <w:p>
@@ -553,7 +602,7 @@
         <w:t xml:space="preserve"> </w:t>
       </w:r>
       <w:r>
-        <w:t xml:space="preserve">presents the data assessment, characterising the quality, structure, and forecasting suitability of the Nielsen scanner data and Indeks Danmark consumer survey, and documenting all preprocessing decisions that inform the modelling phases.</w:t>
+        <w:t xml:space="preserve">presents the data assessment, characterising the quality, structure, and forecasting suitability of the Nielsen scanner data across the five beverage categories, and documenting the preprocessing decisions that inform the modelling.</w:t>
       </w:r>
     </w:p>
     <w:p>
@@ -571,7 +620,7 @@
         <w:t xml:space="preserve"> </w:t>
       </w:r>
       <w:r>
-        <w:t xml:space="preserve">describes the multi-agent framework design, specifying the architecture of the four research agents and their coordination logic, and justifying all architectural choices against the 8GB RAM constraint and the requirements established in Chapters 2 and 3.</w:t>
+        <w:t xml:space="preserve">describes the predictive-extension architecture: the forecasting substrate, the structured forecast-tool interface, and the bounded tool-using agentic decision-support layer, together with the integration-readiness capabilities, justified against the 8GB RAM budget. The evaluated prototype uses a lightweight Python coordinator; a LangGraph deployment is identified as the production target.</w:t>
       </w:r>
     </w:p>
     <w:p>
@@ -589,7 +638,7 @@
         <w:t xml:space="preserve"> </w:t>
       </w:r>
       <w:r>
-        <w:t xml:space="preserve">addresses SRQ1 through an empirical model benchmark, comparing five lightweight forecasting models across accuracy, computational efficiency, and stability metrics, and identifying the optimal model configuration for the Danish CSD context.</w:t>
+        <w:t xml:space="preserve">addresses SRQ1 through an empirical model benchmark, comparing lightweight forecasting models across the five categories on accuracy, memory efficiency, and stability, and testing category specialisation against pooling.</w:t>
       </w:r>
     </w:p>
     <w:p>
@@ -607,7 +656,7 @@
         <w:t xml:space="preserve"> </w:t>
       </w:r>
       <w:r>
-        <w:t xml:space="preserve">addresses SRQ2 and SRQ3 through the Context-Aware Decision Synthesis module, evaluating the Synthesis Agent’s ability to coordinate model outputs and consumer signals into confidence-scored managerial recommendations, and quantifying the marginal value of Indeks Danmark enrichment.</w:t>
+        <w:t xml:space="preserve">addresses SRQ2, and informs SRQ3, through the agentic extension prototype: the tool-using agent that consumes forecasts and their uncertainty through the structured interface and produces decision-support recommendations.</w:t>
       </w:r>
     </w:p>
     <w:p>
@@ -625,7 +674,7 @@
         <w:t xml:space="preserve"> </w:t>
       </w:r>
       <w:r>
-        <w:t xml:space="preserve">addresses SRQ4 through a comparative evaluation of the predictive framework against a descriptive analytics baseline, assessing the incremental decision quality improvement achieved by the predictive transition.</w:t>
+        <w:t xml:space="preserve">addresses SRQ4 through a pilot evaluation comparing dedicated-model agentic decision-support against a general-purpose code-as-action LLM baseline, on correctness, consistency, and replicability (primary) and cost and latency (secondary).</w:t>
       </w:r>
     </w:p>
     <w:p>
@@ -643,7 +692,7 @@
         <w:t xml:space="preserve"> </w:t>
       </w:r>
       <w:r>
-        <w:t xml:space="preserve">discusses the theoretical contributions, practical implications, and limitations of the thesis, situating the findings within the broader literature and identifying concrete directions for future research.</w:t>
+        <w:t xml:space="preserve">discusses the contributions, the integration-readiness findings, and the limitations of the thesis, including pilot-scale evaluation and designed-but-unevaluated calibration, and identifies directions for future research.</w:t>
       </w:r>
     </w:p>
     <w:p>
@@ -661,7 +710,7 @@
         <w:t xml:space="preserve"> </w:t>
       </w:r>
       <w:r>
-        <w:t xml:space="preserve">concludes the thesis by synthesising answers to all four subsidiary research questions and the main research question, and reflecting on the broader implications for AI-augmented business intelligence in resource-constrained environments.</w:t>
+        <w:t xml:space="preserve">concludes by synthesising answers to the four subsidiary research questions and the main research question, and reflecting on the broader implications for extending production-oriented agentic decision-support systems with forecasting capabilities under resource constraints.</w:t>
       </w:r>
     </w:p>
     <w:p>
@@ -671,8 +720,8 @@
         </w:pict>
       </w:r>
     </w:p>
-    <w:bookmarkEnd w:id="13"/>
-    <w:bookmarkStart w:id="14" w:name="references-cited-in-this-chapter"/>
+    <w:bookmarkEnd w:id="17"/>
+    <w:bookmarkStart w:id="18" w:name="references-cited-in-this-chapter"/>
     <w:p>
       <w:pPr>
         <w:pStyle w:val="Heading2"/>
@@ -766,20 +815,20 @@
         </w:numPr>
       </w:pPr>
       <w:r>
-        <w:t xml:space="preserve">Ahrens, A., Hansen, C. B., Schaffer, M. E., &amp; Wiemann, T. (2024). Model averaging and double machine learning.</w:t>
-      </w:r>
-      <w:r>
-        <w:t xml:space="preserve"> </w:t>
-      </w:r>
-      <w:r>
-        <w:rPr>
-          <w:i/>
-          <w:iCs/>
-        </w:rPr>
-        <w:t xml:space="preserve">Journal of Applied Econometrics</w:t>
-      </w:r>
-      <w:r>
-        <w:t xml:space="preserve">. https://doi.org/10.48550/arXiv.2401.01645</w:t>
+        <w:t xml:space="preserve">Liu, S., Guo, B., Yu, Z., et al. (2025). On accelerating edge AI: Optimizing resource-constrained environments.</w:t>
+      </w:r>
+      <w:r>
+        <w:t xml:space="preserve"> </w:t>
+      </w:r>
+      <w:r>
+        <w:rPr>
+          <w:i/>
+          <w:iCs/>
+        </w:rPr>
+        <w:t xml:space="preserve">arXiv preprint arXiv:2501.15014</w:t>
+      </w:r>
+      <w:r>
+        <w:t xml:space="preserve">. [PREPRINT — not peer-reviewed]</w:t>
       </w:r>
     </w:p>
     <w:p>
@@ -829,20 +878,33 @@
         </w:numPr>
       </w:pPr>
       <w:r>
-        <w:t xml:space="preserve">Klee, S., &amp; Xia, Y. (2025). Measuring time series forecast stability for demand planning.</w:t>
-      </w:r>
-      <w:r>
-        <w:t xml:space="preserve"> </w:t>
-      </w:r>
-      <w:r>
-        <w:rPr>
-          <w:i/>
-          <w:iCs/>
-        </w:rPr>
-        <w:t xml:space="preserve">KDD ’25 Workshop on AI for Supply Chain</w:t>
-      </w:r>
-      <w:r>
-        <w:t xml:space="preserve">.</w:t>
+        <w:t xml:space="preserve">Semerikov, S. O., Vakaliuk, T. A., Kanevska, O. B., Ostroushko, O. A., &amp; Kolhatin, A. O. (2025). Edge intelligence unleashed: A survey on deploying large language models in resource-constrained environments.</w:t>
+      </w:r>
+      <w:r>
+        <w:t xml:space="preserve"> </w:t>
+      </w:r>
+      <w:r>
+        <w:rPr>
+          <w:i/>
+          <w:iCs/>
+        </w:rPr>
+        <w:t xml:space="preserve">Journal of Edge Computing</w:t>
+      </w:r>
+      <w:r>
+        <w:t xml:space="preserve">,</w:t>
+      </w:r>
+      <w:r>
+        <w:t xml:space="preserve"> </w:t>
+      </w:r>
+      <w:r>
+        <w:rPr>
+          <w:i/>
+          <w:iCs/>
+        </w:rPr>
+        <w:t xml:space="preserve">4</w:t>
+      </w:r>
+      <w:r>
+        <w:t xml:space="preserve">(2). https://doi.org/10.55056/jec.1000</w:t>
       </w:r>
     </w:p>
     <w:p>
@@ -854,17 +916,17 @@
         </w:numPr>
       </w:pPr>
       <w:r>
-        <w:t xml:space="preserve">Ma, B. J., Jackson, I., Huang, M., Villegas, S., &amp; Macias-Aguayo, J. (2025). A data-driven and context-aware approach for demand forecasting in the beverage industry.</w:t>
-      </w:r>
-      <w:r>
-        <w:t xml:space="preserve"> </w:t>
-      </w:r>
-      <w:r>
-        <w:rPr>
-          <w:i/>
-          <w:iCs/>
-        </w:rPr>
-        <w:t xml:space="preserve">International Journal of Logistics Research and Applications</w:t>
+        <w:t xml:space="preserve">Klee, S., &amp; Xia, Y. (2025). Measuring time series forecast stability for demand planning.</w:t>
+      </w:r>
+      <w:r>
+        <w:t xml:space="preserve"> </w:t>
+      </w:r>
+      <w:r>
+        <w:rPr>
+          <w:i/>
+          <w:iCs/>
+        </w:rPr>
+        <w:t xml:space="preserve">KDD ’25 Workshop on AI for Supply Chain</w:t>
       </w:r>
       <w:r>
         <w:t xml:space="preserve">.</w:t>
@@ -879,33 +941,20 @@
         </w:numPr>
       </w:pPr>
       <w:r>
-        <w:t xml:space="preserve">Makridakis, S., Spiliotis, E., &amp; Assimakopoulos, V. (2020). The M4 competition: 100,000 time series and 61 forecasting methods.</w:t>
-      </w:r>
-      <w:r>
-        <w:t xml:space="preserve"> </w:t>
-      </w:r>
-      <w:r>
-        <w:rPr>
-          <w:i/>
-          <w:iCs/>
-        </w:rPr>
-        <w:t xml:space="preserve">International Journal of Forecasting</w:t>
-      </w:r>
-      <w:r>
-        <w:t xml:space="preserve">,</w:t>
-      </w:r>
-      <w:r>
-        <w:t xml:space="preserve"> </w:t>
-      </w:r>
-      <w:r>
-        <w:rPr>
-          <w:i/>
-          <w:iCs/>
-        </w:rPr>
-        <w:t xml:space="preserve">36</w:t>
-      </w:r>
-      <w:r>
-        <w:t xml:space="preserve">(1), 54–74.</w:t>
+        <w:t xml:space="preserve">Ma, B. J., Jackson, I., Huang, M., Villegas, S., &amp; Macias-Aguayo, J. (2025). A data-driven and context-aware approach for demand forecasting in the beverage industry.</w:t>
+      </w:r>
+      <w:r>
+        <w:t xml:space="preserve"> </w:t>
+      </w:r>
+      <w:r>
+        <w:rPr>
+          <w:i/>
+          <w:iCs/>
+        </w:rPr>
+        <w:t xml:space="preserve">International Journal of Logistics Research and Applications</w:t>
+      </w:r>
+      <w:r>
+        <w:t xml:space="preserve">.</w:t>
       </w:r>
     </w:p>
     <w:p>
@@ -917,7 +966,7 @@
         </w:numPr>
       </w:pPr>
       <w:r>
-        <w:t xml:space="preserve">Makridakis, S., Spiliotis, E., &amp; Assimakopoulos, V. (2022). M5 accuracy competition: Results, findings, and conclusions.</w:t>
+        <w:t xml:space="preserve">Makridakis, S., Spiliotis, E., &amp; Assimakopoulos, V. (2020). The M4 competition: 100,000 time series and 61 forecasting methods.</w:t>
       </w:r>
       <w:r>
         <w:t xml:space="preserve"> </w:t>
@@ -940,10 +989,10 @@
           <w:i/>
           <w:iCs/>
         </w:rPr>
-        <w:t xml:space="preserve">38</w:t>
-      </w:r>
-      <w:r>
-        <w:t xml:space="preserve">(4), 1346–1364.</w:t>
+        <w:t xml:space="preserve">36</w:t>
+      </w:r>
+      <w:r>
+        <w:t xml:space="preserve">(1), 54–74.</w:t>
       </w:r>
     </w:p>
     <w:p>
@@ -955,17 +1004,17 @@
         </w:numPr>
       </w:pPr>
       <w:r>
-        <w:t xml:space="preserve">Ng, S. (2017). Opportunities and challenges: Lessons from analyzing terabytes of scanner data.</w:t>
-      </w:r>
-      <w:r>
-        <w:t xml:space="preserve"> </w:t>
-      </w:r>
-      <w:r>
-        <w:rPr>
-          <w:i/>
-          <w:iCs/>
-        </w:rPr>
-        <w:t xml:space="preserve">NBER Working Paper</w:t>
+        <w:t xml:space="preserve">Makridakis, S., Spiliotis, E., &amp; Assimakopoulos, V. (2022). M5 accuracy competition: Results, findings, and conclusions.</w:t>
+      </w:r>
+      <w:r>
+        <w:t xml:space="preserve"> </w:t>
+      </w:r>
+      <w:r>
+        <w:rPr>
+          <w:i/>
+          <w:iCs/>
+        </w:rPr>
+        <w:t xml:space="preserve">International Journal of Forecasting</w:t>
       </w:r>
       <w:r>
         <w:t xml:space="preserve">,</w:t>
@@ -978,10 +1027,10 @@
           <w:i/>
           <w:iCs/>
         </w:rPr>
-        <w:t xml:space="preserve">23673</w:t>
-      </w:r>
-      <w:r>
-        <w:t xml:space="preserve">.</w:t>
+        <w:t xml:space="preserve">38</w:t>
+      </w:r>
+      <w:r>
+        <w:t xml:space="preserve">(4), 1346–1364.</w:t>
       </w:r>
     </w:p>
     <w:p>
@@ -993,17 +1042,17 @@
         </w:numPr>
       </w:pPr>
       <w:r>
-        <w:t xml:space="preserve">Peffers, K., Tuunanen, T., Rothenberger, M. A., &amp; Chatterjee, S. (2007). A design science research methodology for information systems research.</w:t>
-      </w:r>
-      <w:r>
-        <w:t xml:space="preserve"> </w:t>
-      </w:r>
-      <w:r>
-        <w:rPr>
-          <w:i/>
-          <w:iCs/>
-        </w:rPr>
-        <w:t xml:space="preserve">Journal of Management Information Systems</w:t>
+        <w:t xml:space="preserve">Ng, S. (2017). Opportunities and challenges: Lessons from analyzing terabytes of scanner data.</w:t>
+      </w:r>
+      <w:r>
+        <w:t xml:space="preserve"> </w:t>
+      </w:r>
+      <w:r>
+        <w:rPr>
+          <w:i/>
+          <w:iCs/>
+        </w:rPr>
+        <w:t xml:space="preserve">NBER Working Paper</w:t>
       </w:r>
       <w:r>
         <w:t xml:space="preserve">,</w:t>
@@ -1016,10 +1065,10 @@
           <w:i/>
           <w:iCs/>
         </w:rPr>
-        <w:t xml:space="preserve">24</w:t>
-      </w:r>
-      <w:r>
-        <w:t xml:space="preserve">(3), 45–77.</w:t>
+        <w:t xml:space="preserve">23673</w:t>
+      </w:r>
+      <w:r>
+        <w:t xml:space="preserve">.</w:t>
       </w:r>
     </w:p>
     <w:p>
@@ -1031,6 +1080,44 @@
         </w:numPr>
       </w:pPr>
       <w:r>
+        <w:t xml:space="preserve">Peffers, K., Tuunanen, T., Rothenberger, M. A., &amp; Chatterjee, S. (2007). A design science research methodology for information systems research.</w:t>
+      </w:r>
+      <w:r>
+        <w:t xml:space="preserve"> </w:t>
+      </w:r>
+      <w:r>
+        <w:rPr>
+          <w:i/>
+          <w:iCs/>
+        </w:rPr>
+        <w:t xml:space="preserve">Journal of Management Information Systems</w:t>
+      </w:r>
+      <w:r>
+        <w:t xml:space="preserve">,</w:t>
+      </w:r>
+      <w:r>
+        <w:t xml:space="preserve"> </w:t>
+      </w:r>
+      <w:r>
+        <w:rPr>
+          <w:i/>
+          <w:iCs/>
+        </w:rPr>
+        <w:t xml:space="preserve">24</w:t>
+      </w:r>
+      <w:r>
+        <w:t xml:space="preserve">(3), 45–77.</w:t>
+      </w:r>
+    </w:p>
+    <w:p>
+      <w:pPr>
+        <w:pStyle w:val="Compact"/>
+        <w:numPr>
+          <w:ilvl w:val="0"/>
+          <w:numId w:val="1001"/>
+        </w:numPr>
+      </w:pPr>
+      <w:r>
         <w:t xml:space="preserve">Rinaldi, G., Giordano, F., De Stefano, C., &amp; Fontanella, F. (2025). DSS4EX: A decision support system framework to explore artificial intelligence pipelines with an application in time series forecasting.</w:t>
       </w:r>
       <w:r>
@@ -1060,8 +1147,8 @@
         <w:t xml:space="preserve">, 126421.</w:t>
       </w:r>
     </w:p>
-    <w:bookmarkEnd w:id="14"/>
-    <w:bookmarkEnd w:id="15"/>
+    <w:bookmarkEnd w:id="18"/>
+    <w:bookmarkEnd w:id="19"/>
     <w:sectPr>
       <w:footnotePr>
         <w:numRestart w:val="eachSect"/>
@@ -1088,6 +1175,57 @@
     <w:p>
       <w:r>
         <w:separator/>
+      </w:r>
+    </w:p>
+  </w:footnote>
+  <w:footnote w:id="9">
+    <w:p>
+      <w:pPr>
+        <w:pStyle w:val="FootnoteText"/>
+      </w:pPr>
+      <w:r>
+        <w:rPr>
+          <w:rStyle w:val="FootnoteReference"/>
+        </w:rPr>
+        <w:footnoteRef/>
+      </w:r>
+      <w:r>
+        <w:t xml:space="preserve"> </w:t>
+      </w:r>
+      <w:r>
+        <w:t xml:space="preserve">In the forecasting literature,</w:t>
+      </w:r>
+      <w:r>
+        <w:t xml:space="preserve"> </w:t>
+      </w:r>
+      <w:r>
+        <w:rPr>
+          <w:i/>
+          <w:iCs/>
+        </w:rPr>
+        <w:t xml:space="preserve">explanatory</w:t>
+      </w:r>
+      <w:r>
+        <w:t xml:space="preserve"> </w:t>
+      </w:r>
+      <w:r>
+        <w:t xml:space="preserve">or</w:t>
+      </w:r>
+      <w:r>
+        <w:t xml:space="preserve"> </w:t>
+      </w:r>
+      <w:r>
+        <w:rPr>
+          <w:i/>
+          <w:iCs/>
+        </w:rPr>
+        <w:t xml:space="preserve">exogenous</w:t>
+      </w:r>
+      <w:r>
+        <w:t xml:space="preserve"> </w:t>
+      </w:r>
+      <w:r>
+        <w:t xml:space="preserve">variables are predictors external to the target series itself: factors that carry information about the underlying drivers of demand, rather than being derived solely from the past values of the series being forecast (Makridakis et al., 2022; Ma et al., 2025). Typical examples in the retail demand context include promotional activity, pricing, weather, calendar effects, and macroeconomic or consumer indicators. In this thesis, the exogenous predictors used in the forecasting models comprise promotional signals (units sold under promotion and promotional intensity), distribution coverage (the Nielsen weighted-distribution metric), and calendar and seasonality signals (month, quarter, and a binary indicator for Danish public holidays); these complement the models’ autoregressive features (lagged sales and rolling statistics) derived from the historical sales series itself.</w:t>
       </w:r>
     </w:p>
   </w:footnote>

</xml_diff>